<commit_message>
feat(dht): pemindaian pin otomatis dan diagnostik jalur data DHT22
- dhtScan() menguji 13 pin kandidat dan melaporkan pola pull-up/pull-down
- pin acuan GPIO13 membedakan jalur mengambang dari jalur yang ditahan HIGH
- uji awal memakai pin temuan sehingga perangkat tetap memperoleh data iklim
- perintah Serial baru: scan; perintah dht menampilkan status baca
- dokumentasi perintah Serial dan troubleshooting diperbarui
</commit_message>
<xml_diff>
--- a/docs/Laporan-CO-Zero-SIC8.docx
+++ b/docs/Laporan-CO-Zero-SIC8.docx
@@ -5797,7 +5797,9 @@
         </w:rPr>
         <w:t>---- Status iklim mikro ----</w:t>
         <w:br/>
-        <w:t xml:space="preserve">  DHT22      : terbaca</w:t>
+        <w:t xml:space="preserve">  DHT22      : terbaca (GPIO4)</w:t>
+        <w:br/>
+        <w:t xml:space="preserve">  Status baca: OK (0 kegagalan berurutan)</w:t>
         <w:br/>
         <w:t xml:space="preserve">  Suhu       : 41.2 C  (ambang panas &gt;= 40.0 C)</w:t>
         <w:br/>
@@ -5810,6 +5812,380 @@
         <w:t xml:space="preserve">  Level CO   : WASPADA</w:t>
         <w:br/>
         <w:t xml:space="preserve">  Level akhir: BAHAYA</w:t>
+      </w:r>
+    </w:p>
+    <w:p>
+      <w:pPr>
+        <w:jc w:val="both"/>
+      </w:pPr>
+      <w:r>
+        <w:t>Perintah yang tersedia pada Serial Monitor:</w:t>
+      </w:r>
+    </w:p>
+    <w:tbl>
+      <w:tblPr>
+        <w:tblStyle w:val="TableGrid"/>
+        <w:tblW w:type="auto" w:w="0"/>
+        <w:jc w:val="center"/>
+        <w:tblLayout w:type="fixed"/>
+        <w:tblLook w:firstColumn="1" w:firstRow="1" w:lastColumn="0" w:lastRow="0" w:noHBand="0" w:noVBand="1" w:val="04A0"/>
+      </w:tblPr>
+      <w:tblGrid>
+        <w:gridCol w:w="1162"/>
+        <w:gridCol w:w="7909"/>
+      </w:tblGrid>
+      <w:tr>
+        <w:trPr>
+          <w:cantSplit/>
+          <w:tblHeader w:val="true"/>
+        </w:trPr>
+        <w:tc>
+          <w:tcPr>
+            <w:tcW w:type="dxa" w:w="1162"/>
+            <w:shd w:val="clear" w:color="auto" w:fill="1A3C6E"/>
+          </w:tcPr>
+          <w:p>
+            <w:pPr>
+              <w:spacing w:after="20" w:before="20" w:line="240" w:lineRule="auto"/>
+            </w:pPr>
+            <w:r>
+              <w:rPr>
+                <w:color w:val="FFFFFF"/>
+              </w:rPr>
+            </w:r>
+            <w:r>
+              <w:rPr>
+                <w:b/>
+                <w:color w:val="FFFFFF"/>
+                <w:sz w:val="18"/>
+              </w:rPr>
+              <w:t>Perintah</w:t>
+            </w:r>
+          </w:p>
+        </w:tc>
+        <w:tc>
+          <w:tcPr>
+            <w:tcW w:type="dxa" w:w="7909"/>
+            <w:shd w:val="clear" w:color="auto" w:fill="1A3C6E"/>
+          </w:tcPr>
+          <w:p>
+            <w:pPr>
+              <w:spacing w:after="20" w:before="20" w:line="240" w:lineRule="auto"/>
+            </w:pPr>
+            <w:r>
+              <w:rPr>
+                <w:color w:val="FFFFFF"/>
+              </w:rPr>
+            </w:r>
+            <w:r>
+              <w:rPr>
+                <w:b/>
+                <w:color w:val="FFFFFF"/>
+                <w:sz w:val="18"/>
+              </w:rPr>
+              <w:t>Fungsi</w:t>
+            </w:r>
+          </w:p>
+        </w:tc>
+      </w:tr>
+      <w:tr>
+        <w:trPr>
+          <w:cantSplit/>
+        </w:trPr>
+        <w:tc>
+          <w:tcPr>
+            <w:tcW w:type="dxa" w:w="1162"/>
+          </w:tcPr>
+          <w:p>
+            <w:pPr>
+              <w:spacing w:after="20" w:before="20" w:line="240" w:lineRule="auto"/>
+            </w:pPr>
+            <w:r/>
+            <w:r>
+              <w:rPr>
+                <w:rFonts w:ascii="Courier New" w:hAnsi="Courier New" w:eastAsia="Courier New"/>
+                <w:sz w:val="16"/>
+              </w:rPr>
+              <w:t>c1 &lt;ppm&gt;</w:t>
+            </w:r>
+          </w:p>
+        </w:tc>
+        <w:tc>
+          <w:tcPr>
+            <w:tcW w:type="dxa" w:w="7909"/>
+          </w:tcPr>
+          <w:p>
+            <w:pPr>
+              <w:spacing w:after="20" w:before="20" w:line="240" w:lineRule="auto"/>
+            </w:pPr>
+            <w:r/>
+            <w:r>
+              <w:rPr>
+                <w:sz w:val="18"/>
+              </w:rPr>
+              <w:t>menetapkan titik kalibrasi pertama pada konsentrasi gas acuan yang diketahui</w:t>
+            </w:r>
+          </w:p>
+        </w:tc>
+      </w:tr>
+      <w:tr>
+        <w:trPr>
+          <w:cantSplit/>
+        </w:trPr>
+        <w:tc>
+          <w:tcPr>
+            <w:tcW w:type="dxa" w:w="1162"/>
+            <w:shd w:val="clear" w:color="auto" w:fill="F4F6FA"/>
+          </w:tcPr>
+          <w:p>
+            <w:pPr>
+              <w:spacing w:after="20" w:before="20" w:line="240" w:lineRule="auto"/>
+            </w:pPr>
+            <w:r/>
+            <w:r>
+              <w:rPr>
+                <w:rFonts w:ascii="Courier New" w:hAnsi="Courier New" w:eastAsia="Courier New"/>
+                <w:sz w:val="16"/>
+              </w:rPr>
+              <w:t>c2 &lt;ppm&gt;</w:t>
+            </w:r>
+          </w:p>
+        </w:tc>
+        <w:tc>
+          <w:tcPr>
+            <w:tcW w:type="dxa" w:w="7909"/>
+            <w:shd w:val="clear" w:color="auto" w:fill="F4F6FA"/>
+          </w:tcPr>
+          <w:p>
+            <w:pPr>
+              <w:spacing w:after="20" w:before="20" w:line="240" w:lineRule="auto"/>
+            </w:pPr>
+            <w:r/>
+            <w:r>
+              <w:rPr>
+                <w:sz w:val="18"/>
+              </w:rPr>
+              <w:t>menetapkan titik kalibrasi kedua; kedua titik menentukan koefisien skala logaritmik</w:t>
+            </w:r>
+          </w:p>
+        </w:tc>
+      </w:tr>
+      <w:tr>
+        <w:trPr>
+          <w:cantSplit/>
+        </w:trPr>
+        <w:tc>
+          <w:tcPr>
+            <w:tcW w:type="dxa" w:w="1162"/>
+          </w:tcPr>
+          <w:p>
+            <w:pPr>
+              <w:spacing w:after="20" w:before="20" w:line="240" w:lineRule="auto"/>
+            </w:pPr>
+            <w:r/>
+            <w:r>
+              <w:rPr>
+                <w:rFonts w:ascii="Courier New" w:hAnsi="Courier New" w:eastAsia="Courier New"/>
+                <w:sz w:val="16"/>
+              </w:rPr>
+              <w:t>dht</w:t>
+            </w:r>
+          </w:p>
+        </w:tc>
+        <w:tc>
+          <w:tcPr>
+            <w:tcW w:type="dxa" w:w="7909"/>
+          </w:tcPr>
+          <w:p>
+            <w:pPr>
+              <w:spacing w:after="20" w:before="20" w:line="240" w:lineRule="auto"/>
+            </w:pPr>
+            <w:r/>
+            <w:r>
+              <w:rPr>
+                <w:sz w:val="18"/>
+              </w:rPr>
+              <w:t>menampilkan status iklim mikro, jumlah kegagalan berurutan, dan hasil uji jalur data</w:t>
+            </w:r>
+          </w:p>
+        </w:tc>
+      </w:tr>
+      <w:tr>
+        <w:trPr>
+          <w:cantSplit/>
+        </w:trPr>
+        <w:tc>
+          <w:tcPr>
+            <w:tcW w:type="dxa" w:w="1162"/>
+            <w:shd w:val="clear" w:color="auto" w:fill="F4F6FA"/>
+          </w:tcPr>
+          <w:p>
+            <w:pPr>
+              <w:spacing w:after="20" w:before="20" w:line="240" w:lineRule="auto"/>
+            </w:pPr>
+            <w:r/>
+            <w:r>
+              <w:rPr>
+                <w:rFonts w:ascii="Courier New" w:hAnsi="Courier New" w:eastAsia="Courier New"/>
+                <w:sz w:val="16"/>
+              </w:rPr>
+              <w:t>scan</w:t>
+            </w:r>
+          </w:p>
+        </w:tc>
+        <w:tc>
+          <w:tcPr>
+            <w:tcW w:type="dxa" w:w="7909"/>
+            <w:shd w:val="clear" w:color="auto" w:fill="F4F6FA"/>
+          </w:tcPr>
+          <w:p>
+            <w:pPr>
+              <w:spacing w:after="20" w:before="20" w:line="240" w:lineRule="auto"/>
+            </w:pPr>
+            <w:r/>
+            <w:r>
+              <w:rPr>
+                <w:sz w:val="18"/>
+              </w:rPr>
+              <w:t>menguji pin kandidat untuk menemukan pin tempat DHT22 benar-benar terpasang</w:t>
+            </w:r>
+          </w:p>
+        </w:tc>
+      </w:tr>
+      <w:tr>
+        <w:trPr>
+          <w:cantSplit/>
+        </w:trPr>
+        <w:tc>
+          <w:tcPr>
+            <w:tcW w:type="dxa" w:w="1162"/>
+          </w:tcPr>
+          <w:p>
+            <w:pPr>
+              <w:spacing w:after="20" w:before="20" w:line="240" w:lineRule="auto"/>
+            </w:pPr>
+            <w:r/>
+            <w:r>
+              <w:rPr>
+                <w:rFonts w:ascii="Courier New" w:hAnsi="Courier New" w:eastAsia="Courier New"/>
+                <w:sz w:val="16"/>
+              </w:rPr>
+              <w:t>r</w:t>
+            </w:r>
+          </w:p>
+        </w:tc>
+        <w:tc>
+          <w:tcPr>
+            <w:tcW w:type="dxa" w:w="7909"/>
+          </w:tcPr>
+          <w:p>
+            <w:pPr>
+              <w:spacing w:after="20" w:before="20" w:line="240" w:lineRule="auto"/>
+            </w:pPr>
+            <w:r/>
+            <w:r>
+              <w:rPr>
+                <w:sz w:val="18"/>
+              </w:rPr>
+              <w:t>mengembalikan skala sensor ke nilai bawaan</w:t>
+            </w:r>
+          </w:p>
+        </w:tc>
+      </w:tr>
+      <w:tr>
+        <w:trPr>
+          <w:cantSplit/>
+        </w:trPr>
+        <w:tc>
+          <w:tcPr>
+            <w:tcW w:type="dxa" w:w="1162"/>
+            <w:shd w:val="clear" w:color="auto" w:fill="F4F6FA"/>
+          </w:tcPr>
+          <w:p>
+            <w:pPr>
+              <w:spacing w:after="20" w:before="20" w:line="240" w:lineRule="auto"/>
+            </w:pPr>
+            <w:r/>
+            <w:r>
+              <w:rPr>
+                <w:rFonts w:ascii="Courier New" w:hAnsi="Courier New" w:eastAsia="Courier New"/>
+                <w:sz w:val="16"/>
+              </w:rPr>
+              <w:t>?</w:t>
+            </w:r>
+          </w:p>
+        </w:tc>
+        <w:tc>
+          <w:tcPr>
+            <w:tcW w:type="dxa" w:w="7909"/>
+            <w:shd w:val="clear" w:color="auto" w:fill="F4F6FA"/>
+          </w:tcPr>
+          <w:p>
+            <w:pPr>
+              <w:spacing w:after="20" w:before="20" w:line="240" w:lineRule="auto"/>
+            </w:pPr>
+            <w:r/>
+            <w:r>
+              <w:rPr>
+                <w:sz w:val="18"/>
+              </w:rPr>
+              <w:t>menampilkan status kalibrasi beserta daftar perintah</w:t>
+            </w:r>
+          </w:p>
+        </w:tc>
+      </w:tr>
+    </w:tbl>
+    <w:p>
+      <w:pPr>
+        <w:spacing w:after="40" w:line="240" w:lineRule="auto"/>
+      </w:pPr>
+    </w:p>
+    <w:p>
+      <w:pPr>
+        <w:jc w:val="both"/>
+      </w:pPr>
+      <w:r>
+        <w:t xml:space="preserve">Perintah </w:t>
+      </w:r>
+      <w:r>
+        <w:rPr>
+          <w:rFonts w:ascii="Courier New" w:hAnsi="Courier New" w:eastAsia="Courier New"/>
+          <w:sz w:val="19"/>
+        </w:rPr>
+        <w:t>dht</w:t>
+      </w:r>
+      <w:r>
+        <w:t xml:space="preserve"> dan </w:t>
+      </w:r>
+      <w:r>
+        <w:rPr>
+          <w:rFonts w:ascii="Courier New" w:hAnsi="Courier New" w:eastAsia="Courier New"/>
+          <w:sz w:val="19"/>
+        </w:rPr>
+        <w:t>scan</w:t>
+      </w:r>
+      <w:r>
+        <w:t xml:space="preserve"> bersifat diagnostik dan tidak mengubah kalibrasi maupun level yang sedang berjalan. Perintah </w:t>
+      </w:r>
+      <w:r>
+        <w:rPr>
+          <w:rFonts w:ascii="Courier New" w:hAnsi="Courier New" w:eastAsia="Courier New"/>
+          <w:sz w:val="19"/>
+        </w:rPr>
+        <w:t>scan</w:t>
+      </w:r>
+      <w:r>
+        <w:t xml:space="preserve"> diperlukan karena kanvas Wokwi merutekan kabel secara otomatis sehingga sambungan yang bertumpuk sulit diperiksa secara visual; hasil pemindaian menyebutkan nomor GPIO tempat sensor menjawab atau menyatakan bahwa sensor tidak ditemukan pada pin mana pun. Uji awal saat perangkat menyala menjalankan pemindaian yang sama secara otomatis, sehingga perangkat tetap memperoleh data iklim mikro meskipun sensor terpasang pada pin yang berbeda dari </w:t>
+      </w:r>
+      <w:r>
+        <w:rPr>
+          <w:rFonts w:ascii="Courier New" w:hAnsi="Courier New" w:eastAsia="Courier New"/>
+          <w:sz w:val="19"/>
+        </w:rPr>
+        <w:t>#define PIN_DHT</w:t>
+      </w:r>
+      <w:r>
+        <w:t>.</w:t>
       </w:r>
     </w:p>
     <w:p>

</xml_diff>